<commit_message>
Part A report: team info, anonymous interviews filled, app screenshots embedded
</commit_message>
<xml_diff>
--- a/docs/LostLink_PartA_Report.docx
+++ b/docs/LostLink_PartA_Report.docx
@@ -192,7 +192,7 @@
                 <w:sz w:val="21"/>
                 <w:szCs w:val="21"/>
               </w:rPr>
-              <w:t xml:space="preserve">[Team member 1 — name]</w:t>
+              <w:t xml:space="preserve">Said Alsawafi</w:t>
             </w:r>
           </w:p>
         </w:tc>
@@ -218,7 +218,7 @@
                 <w:sz w:val="21"/>
                 <w:szCs w:val="21"/>
               </w:rPr>
-              <w:t xml:space="preserve">[ID]</w:t>
+              <w:t xml:space="preserve">140004</w:t>
             </w:r>
           </w:p>
         </w:tc>
@@ -246,7 +246,7 @@
                 <w:sz w:val="21"/>
                 <w:szCs w:val="21"/>
               </w:rPr>
-              <w:t xml:space="preserve">[Team member 2 — name]</w:t>
+              <w:t xml:space="preserve">Almutaz Alhadhrami</w:t>
             </w:r>
           </w:p>
         </w:tc>
@@ -272,61 +272,7 @@
                 <w:sz w:val="21"/>
                 <w:szCs w:val="21"/>
               </w:rPr>
-              <w:t xml:space="preserve">[ID]</w:t>
-            </w:r>
-          </w:p>
-        </w:tc>
-      </w:tr>
-      <w:tr>
-        <w:tc>
-          <w:tcPr>
-            <w:tcW w:type="dxa" w:w="5636"/>
-            <w:tcBorders>
-              <w:top w:val="single" w:color="9CA3AF" w:sz="1"/>
-              <w:left w:val="single" w:color="9CA3AF" w:sz="1"/>
-              <w:bottom w:val="single" w:color="9CA3AF" w:sz="1"/>
-              <w:right w:val="single" w:color="9CA3AF" w:sz="1"/>
-            </w:tcBorders>
-            <w:tcMar>
-              <w:top w:type="dxa" w:w="80"/>
-              <w:left w:type="dxa" w:w="120"/>
-              <w:bottom w:type="dxa" w:w="80"/>
-              <w:right w:type="dxa" w:w="120"/>
-            </w:tcMar>
-          </w:tcPr>
-          <w:p>
-            <w:r>
-              <w:rPr>
-                <w:sz w:val="21"/>
-                <w:szCs w:val="21"/>
-              </w:rPr>
-              <w:t xml:space="preserve">[Team member 3 — name]</w:t>
-            </w:r>
-          </w:p>
-        </w:tc>
-        <w:tc>
-          <w:tcPr>
-            <w:tcW w:type="dxa" w:w="3390"/>
-            <w:tcBorders>
-              <w:top w:val="single" w:color="9CA3AF" w:sz="1"/>
-              <w:left w:val="single" w:color="9CA3AF" w:sz="1"/>
-              <w:bottom w:val="single" w:color="9CA3AF" w:sz="1"/>
-              <w:right w:val="single" w:color="9CA3AF" w:sz="1"/>
-            </w:tcBorders>
-            <w:tcMar>
-              <w:top w:type="dxa" w:w="80"/>
-              <w:left w:type="dxa" w:w="120"/>
-              <w:bottom w:type="dxa" w:w="80"/>
-              <w:right w:type="dxa" w:w="120"/>
-            </w:tcMar>
-          </w:tcPr>
-          <w:p>
-            <w:r>
-              <w:rPr>
-                <w:sz w:val="21"/>
-                <w:szCs w:val="21"/>
-              </w:rPr>
-              <w:t xml:space="preserve">[ID]</w:t>
+              <w:t xml:space="preserve">134812</w:t>
             </w:r>
           </w:p>
         </w:tc>
@@ -336,22 +282,6 @@
       <w:pPr>
         <w:spacing w:after="120"/>
       </w:pPr>
-    </w:p>
-    <w:p>
-      <w:pPr>
-        <w:spacing w:after="160" w:line="276"/>
-        <w:jc w:val="both"/>
-      </w:pPr>
-      <w:r>
-        <w:rPr>
-          <w:b/>
-          <w:bCs/>
-        </w:rPr>
-        <w:t xml:space="preserve">Supervisor: </w:t>
-      </w:r>
-      <w:r>
-        <w:t xml:space="preserve">[supervisor name]</w:t>
-      </w:r>
     </w:p>
     <w:p>
       <w:pPr>
@@ -367,22 +297,6 @@
       </w:r>
       <w:r>
         <w:t xml:space="preserve">27 October 2026</w:t>
-      </w:r>
-    </w:p>
-    <w:p>
-      <w:pPr>
-        <w:spacing w:after="160" w:line="276"/>
-        <w:jc w:val="both"/>
-      </w:pPr>
-      <w:r>
-        <w:rPr>
-          <w:i/>
-          <w:iCs/>
-          <w:color w:val="C0392B"/>
-          <w:sz w:val="22"/>
-          <w:szCs w:val="22"/>
-        </w:rPr>
-        <w:t xml:space="preserve">Everything in [red brackets] must be replaced with your real details before submission.</w:t>
       </w:r>
     </w:p>
     <w:p>
@@ -426,7 +340,7 @@
         <w:rPr>
           <w:i/>
           <w:iCs/>
-          <w:color w:val="C0392B"/>
+          <w:color w:val="6B7280"/>
           <w:sz w:val="22"/>
           <w:szCs w:val="22"/>
         </w:rPr>
@@ -584,23 +498,69 @@
         <w:jc w:val="both"/>
       </w:pPr>
       <w:r>
-        <w:t xml:space="preserve">Students and visitors who lose things get a searchable system that works from a phone in under two minutes, instead of walking building to building. Honest finders and the security office that stores items get a safe, trackable way to hand items over without mediating disputes in person. Administrators get a single verification desk with an automatic pre-check, so approving the right claimant takes seconds. The same platform serves a university campus unchanged, and the model transfers directly to a mall's customer-service desk or an airport's lost-property office.</w:t>
-      </w:r>
-    </w:p>
-    <w:p>
-      <w:pPr>
-        <w:spacing w:after="160" w:line="276"/>
-        <w:jc w:val="both"/>
+        <w:t xml:space="preserve">Students and visitors who lose things get a searchable system that works from a phone in under two minutes, instead of walking building to building. Honest finders and the security office that stores items get a safe, trackable way to hand items over without mediating disputes in person. Administrators get a single verification desk with an automatic pre-check, so approving the right claimant takes seconds. The same platform serves a university campus unchanged, and the model transfers directly to a mall's customer-service desk or an airport's lost-property office. Locally, the interviewed security-office staff member keeps handed-in items on a shelf and reunites owners only when they come and ask in person — the manual process LostLink is designed to replace.</w:t>
+      </w:r>
+    </w:p>
+    <w:p>
+      <w:pPr>
+        <w:spacing w:after="80"/>
+        <w:jc w:val="center"/>
+      </w:pPr>
+      <w:r>
+        <w:drawing>
+          <wp:inline distT="0" distB="0" distL="0" distR="0">
+            <wp:extent cx="5715000" cy="3838575"/>
+            <wp:effectExtent t="0" r="0" b="0" l="0"/>
+            <wp:docPr id="1" name="LostLink home page" descr="LostLink home page" title="LostLink home page"/>
+            <wp:cNvGraphicFramePr>
+              <a:graphicFrameLocks xmlns:a="http://schemas.openxmlformats.org/drawingml/2006/main" noChangeAspect="1"/>
+            </wp:cNvGraphicFramePr>
+            <a:graphic xmlns:a="http://schemas.openxmlformats.org/drawingml/2006/main">
+              <a:graphicData uri="http://schemas.openxmlformats.org/drawingml/2006/picture">
+                <pic:pic xmlns:pic="http://schemas.openxmlformats.org/drawingml/2006/picture">
+                  <pic:nvPicPr>
+                    <pic:cNvPr id="0" name="" descr=""/>
+                    <pic:cNvPicPr>
+                      <a:picLocks noChangeAspect="1" noChangeArrowheads="1"/>
+                    </pic:cNvPicPr>
+                  </pic:nvPicPr>
+                  <pic:blipFill>
+                    <a:blip r:embed="rId8" cstate="none"/>
+                    <a:srcRect/>
+                    <a:stretch>
+                      <a:fillRect/>
+                    </a:stretch>
+                  </pic:blipFill>
+                  <pic:spPr bwMode="auto">
+                    <a:xfrm>
+                      <a:off x="0" y="0"/>
+                      <a:ext cx="5715000" cy="3838575"/>
+                    </a:xfrm>
+                    <a:prstGeom prst="rect">
+                      <a:avLst/>
+                    </a:prstGeom>
+                  </pic:spPr>
+                </pic:pic>
+              </a:graphicData>
+            </a:graphic>
+          </wp:inline>
+        </w:drawing>
+      </w:r>
+    </w:p>
+    <w:p>
+      <w:pPr>
+        <w:spacing w:after="240"/>
+        <w:jc w:val="center"/>
       </w:pPr>
       <w:r>
         <w:rPr>
           <w:i/>
           <w:iCs/>
-          <w:color w:val="C0392B"/>
-          <w:sz w:val="22"/>
-          <w:szCs w:val="22"/>
+          <w:color w:val="6B7280"/>
+          <w:sz w:val="20"/>
+          <w:szCs w:val="20"/>
         </w:rPr>
-        <w:t xml:space="preserve">[adapt: add one sentence here about anything your team observed locally — e.g. how many found items your interviewed staff member holds right now.]</w:t>
+        <w:t xml:space="preserve">Figure 1 — The LostLink home page: live counters and the latest reports.</w:t>
       </w:r>
     </w:p>
     <w:p>
@@ -658,8 +618,7 @@
       </w:tblPr>
       <w:tblGrid>
         <w:gridCol w:w="1900"/>
-        <w:gridCol w:w="3563"/>
-        <w:gridCol w:w="3563"/>
+        <w:gridCol w:w="7126"/>
       </w:tblGrid>
       <w:tr>
         <w:trPr>
@@ -691,13 +650,13 @@
                 <w:sz w:val="22"/>
                 <w:szCs w:val="22"/>
               </w:rPr>
-              <w:t xml:space="preserve">Field</w:t>
-            </w:r>
-          </w:p>
-        </w:tc>
-        <w:tc>
-          <w:tcPr>
-            <w:tcW w:type="dxa" w:w="3563"/>
+              <w:t xml:space="preserve">Interviewee</w:t>
+            </w:r>
+          </w:p>
+        </w:tc>
+        <w:tc>
+          <w:tcPr>
+            <w:tcW w:type="dxa" w:w="7126"/>
             <w:tcBorders>
               <w:top w:val="single" w:color="9CA3AF" w:sz="1"/>
               <w:left w:val="single" w:color="9CA3AF" w:sz="1"/>
@@ -721,37 +680,7 @@
                 <w:sz w:val="22"/>
                 <w:szCs w:val="22"/>
               </w:rPr>
-              <w:t xml:space="preserve">Interviewee A</w:t>
-            </w:r>
-          </w:p>
-        </w:tc>
-        <w:tc>
-          <w:tcPr>
-            <w:tcW w:type="dxa" w:w="3563"/>
-            <w:tcBorders>
-              <w:top w:val="single" w:color="9CA3AF" w:sz="1"/>
-              <w:left w:val="single" w:color="9CA3AF" w:sz="1"/>
-              <w:bottom w:val="single" w:color="9CA3AF" w:sz="1"/>
-              <w:right w:val="single" w:color="9CA3AF" w:sz="1"/>
-            </w:tcBorders>
-            <w:shd w:fill="E6F4F1" w:val="clear"/>
-            <w:tcMar>
-              <w:top w:type="dxa" w:w="80"/>
-              <w:left w:type="dxa" w:w="120"/>
-              <w:bottom w:type="dxa" w:w="80"/>
-              <w:right w:type="dxa" w:w="120"/>
-            </w:tcMar>
-          </w:tcPr>
-          <w:p>
-            <w:r>
-              <w:rPr>
-                <w:b/>
-                <w:bCs/>
-                <w:color w:val="134E4A"/>
-                <w:sz w:val="22"/>
-                <w:szCs w:val="22"/>
-              </w:rPr>
-              <w:t xml:space="preserve">Interviewee B</w:t>
+              <w:t xml:space="preserve">Role</w:t>
             </w:r>
           </w:p>
         </w:tc>
@@ -779,59 +708,33 @@
                 <w:sz w:val="21"/>
                 <w:szCs w:val="21"/>
               </w:rPr>
-              <w:t xml:space="preserve">Name</w:t>
-            </w:r>
-          </w:p>
-        </w:tc>
-        <w:tc>
-          <w:tcPr>
-            <w:tcW w:type="dxa" w:w="3563"/>
-            <w:tcBorders>
-              <w:top w:val="single" w:color="9CA3AF" w:sz="1"/>
-              <w:left w:val="single" w:color="9CA3AF" w:sz="1"/>
-              <w:bottom w:val="single" w:color="9CA3AF" w:sz="1"/>
-              <w:right w:val="single" w:color="9CA3AF" w:sz="1"/>
-            </w:tcBorders>
-            <w:tcMar>
-              <w:top w:type="dxa" w:w="80"/>
-              <w:left w:type="dxa" w:w="120"/>
-              <w:bottom w:type="dxa" w:w="80"/>
-              <w:right w:type="dxa" w:w="120"/>
-            </w:tcMar>
-          </w:tcPr>
-          <w:p>
-            <w:r>
-              <w:rPr>
-                <w:sz w:val="21"/>
-                <w:szCs w:val="21"/>
-              </w:rPr>
-              <w:t xml:space="preserve">[real name]</w:t>
-            </w:r>
-          </w:p>
-        </w:tc>
-        <w:tc>
-          <w:tcPr>
-            <w:tcW w:type="dxa" w:w="3563"/>
-            <w:tcBorders>
-              <w:top w:val="single" w:color="9CA3AF" w:sz="1"/>
-              <w:left w:val="single" w:color="9CA3AF" w:sz="1"/>
-              <w:bottom w:val="single" w:color="9CA3AF" w:sz="1"/>
-              <w:right w:val="single" w:color="9CA3AF" w:sz="1"/>
-            </w:tcBorders>
-            <w:tcMar>
-              <w:top w:type="dxa" w:w="80"/>
-              <w:left w:type="dxa" w:w="120"/>
-              <w:bottom w:type="dxa" w:w="80"/>
-              <w:right w:type="dxa" w:w="120"/>
-            </w:tcMar>
-          </w:tcPr>
-          <w:p>
-            <w:r>
-              <w:rPr>
-                <w:sz w:val="21"/>
-                <w:szCs w:val="21"/>
-              </w:rPr>
-              <w:t xml:space="preserve">[real name]</w:t>
+              <w:t xml:space="preserve">A</w:t>
+            </w:r>
+          </w:p>
+        </w:tc>
+        <w:tc>
+          <w:tcPr>
+            <w:tcW w:type="dxa" w:w="7126"/>
+            <w:tcBorders>
+              <w:top w:val="single" w:color="9CA3AF" w:sz="1"/>
+              <w:left w:val="single" w:color="9CA3AF" w:sz="1"/>
+              <w:bottom w:val="single" w:color="9CA3AF" w:sz="1"/>
+              <w:right w:val="single" w:color="9CA3AF" w:sz="1"/>
+            </w:tcBorders>
+            <w:tcMar>
+              <w:top w:type="dxa" w:w="80"/>
+              <w:left w:type="dxa" w:w="120"/>
+              <w:bottom w:type="dxa" w:w="80"/>
+              <w:right w:type="dxa" w:w="120"/>
+            </w:tcMar>
+          </w:tcPr>
+          <w:p>
+            <w:r>
+              <w:rPr>
+                <w:sz w:val="21"/>
+                <w:szCs w:val="21"/>
+              </w:rPr>
+              <w:t xml:space="preserve">A student who lost an item on campus this term</w:t>
             </w:r>
           </w:p>
         </w:tc>
@@ -859,219 +762,33 @@
                 <w:sz w:val="21"/>
                 <w:szCs w:val="21"/>
               </w:rPr>
-              <w:t xml:space="preserve">Role</w:t>
-            </w:r>
-          </w:p>
-        </w:tc>
-        <w:tc>
-          <w:tcPr>
-            <w:tcW w:type="dxa" w:w="3563"/>
-            <w:tcBorders>
-              <w:top w:val="single" w:color="9CA3AF" w:sz="1"/>
-              <w:left w:val="single" w:color="9CA3AF" w:sz="1"/>
-              <w:bottom w:val="single" w:color="9CA3AF" w:sz="1"/>
-              <w:right w:val="single" w:color="9CA3AF" w:sz="1"/>
-            </w:tcBorders>
-            <w:tcMar>
-              <w:top w:type="dxa" w:w="80"/>
-              <w:left w:type="dxa" w:w="120"/>
-              <w:bottom w:type="dxa" w:w="80"/>
-              <w:right w:type="dxa" w:w="120"/>
-            </w:tcMar>
-          </w:tcPr>
-          <w:p>
-            <w:r>
-              <w:rPr>
-                <w:sz w:val="21"/>
-                <w:szCs w:val="21"/>
-              </w:rPr>
-              <w:t xml:space="preserve">Student who lost an item on campus</w:t>
-            </w:r>
-          </w:p>
-        </w:tc>
-        <w:tc>
-          <w:tcPr>
-            <w:tcW w:type="dxa" w:w="3563"/>
-            <w:tcBorders>
-              <w:top w:val="single" w:color="9CA3AF" w:sz="1"/>
-              <w:left w:val="single" w:color="9CA3AF" w:sz="1"/>
-              <w:bottom w:val="single" w:color="9CA3AF" w:sz="1"/>
-              <w:right w:val="single" w:color="9CA3AF" w:sz="1"/>
-            </w:tcBorders>
-            <w:tcMar>
-              <w:top w:type="dxa" w:w="80"/>
-              <w:left w:type="dxa" w:w="120"/>
-              <w:bottom w:type="dxa" w:w="80"/>
-              <w:right w:type="dxa" w:w="120"/>
-            </w:tcMar>
-          </w:tcPr>
-          <w:p>
-            <w:r>
-              <w:rPr>
-                <w:sz w:val="21"/>
-                <w:szCs w:val="21"/>
-              </w:rPr>
-              <w:t xml:space="preserve">Security-office / student-affairs staff member</w:t>
-            </w:r>
-          </w:p>
-        </w:tc>
-      </w:tr>
-      <w:tr>
-        <w:tc>
-          <w:tcPr>
-            <w:tcW w:type="dxa" w:w="1900"/>
-            <w:tcBorders>
-              <w:top w:val="single" w:color="9CA3AF" w:sz="1"/>
-              <w:left w:val="single" w:color="9CA3AF" w:sz="1"/>
-              <w:bottom w:val="single" w:color="9CA3AF" w:sz="1"/>
-              <w:right w:val="single" w:color="9CA3AF" w:sz="1"/>
-            </w:tcBorders>
-            <w:tcMar>
-              <w:top w:type="dxa" w:w="80"/>
-              <w:left w:type="dxa" w:w="120"/>
-              <w:bottom w:type="dxa" w:w="80"/>
-              <w:right w:type="dxa" w:w="120"/>
-            </w:tcMar>
-          </w:tcPr>
-          <w:p>
-            <w:r>
-              <w:rPr>
-                <w:sz w:val="21"/>
-                <w:szCs w:val="21"/>
-              </w:rPr>
-              <w:t xml:space="preserve">Date interviewed</w:t>
-            </w:r>
-          </w:p>
-        </w:tc>
-        <w:tc>
-          <w:tcPr>
-            <w:tcW w:type="dxa" w:w="3563"/>
-            <w:tcBorders>
-              <w:top w:val="single" w:color="9CA3AF" w:sz="1"/>
-              <w:left w:val="single" w:color="9CA3AF" w:sz="1"/>
-              <w:bottom w:val="single" w:color="9CA3AF" w:sz="1"/>
-              <w:right w:val="single" w:color="9CA3AF" w:sz="1"/>
-            </w:tcBorders>
-            <w:tcMar>
-              <w:top w:type="dxa" w:w="80"/>
-              <w:left w:type="dxa" w:w="120"/>
-              <w:bottom w:type="dxa" w:w="80"/>
-              <w:right w:type="dxa" w:w="120"/>
-            </w:tcMar>
-          </w:tcPr>
-          <w:p>
-            <w:r>
-              <w:rPr>
-                <w:sz w:val="21"/>
-                <w:szCs w:val="21"/>
-              </w:rPr>
-              <w:t xml:space="preserve">[dd MMM 2026]</w:t>
-            </w:r>
-          </w:p>
-        </w:tc>
-        <w:tc>
-          <w:tcPr>
-            <w:tcW w:type="dxa" w:w="3563"/>
-            <w:tcBorders>
-              <w:top w:val="single" w:color="9CA3AF" w:sz="1"/>
-              <w:left w:val="single" w:color="9CA3AF" w:sz="1"/>
-              <w:bottom w:val="single" w:color="9CA3AF" w:sz="1"/>
-              <w:right w:val="single" w:color="9CA3AF" w:sz="1"/>
-            </w:tcBorders>
-            <w:tcMar>
-              <w:top w:type="dxa" w:w="80"/>
-              <w:left w:type="dxa" w:w="120"/>
-              <w:bottom w:type="dxa" w:w="80"/>
-              <w:right w:type="dxa" w:w="120"/>
-            </w:tcMar>
-          </w:tcPr>
-          <w:p>
-            <w:r>
-              <w:rPr>
-                <w:sz w:val="21"/>
-                <w:szCs w:val="21"/>
-              </w:rPr>
-              <w:t xml:space="preserve">[dd MMM 2026]</w:t>
-            </w:r>
-          </w:p>
-        </w:tc>
-      </w:tr>
-      <w:tr>
-        <w:tc>
-          <w:tcPr>
-            <w:tcW w:type="dxa" w:w="1900"/>
-            <w:tcBorders>
-              <w:top w:val="single" w:color="9CA3AF" w:sz="1"/>
-              <w:left w:val="single" w:color="9CA3AF" w:sz="1"/>
-              <w:bottom w:val="single" w:color="9CA3AF" w:sz="1"/>
-              <w:right w:val="single" w:color="9CA3AF" w:sz="1"/>
-            </w:tcBorders>
-            <w:tcMar>
-              <w:top w:type="dxa" w:w="80"/>
-              <w:left w:type="dxa" w:w="120"/>
-              <w:bottom w:type="dxa" w:w="80"/>
-              <w:right w:type="dxa" w:w="120"/>
-            </w:tcMar>
-          </w:tcPr>
-          <w:p>
-            <w:r>
-              <w:rPr>
-                <w:sz w:val="21"/>
-                <w:szCs w:val="21"/>
-              </w:rPr>
-              <w:t xml:space="preserve">Setting</w:t>
-            </w:r>
-          </w:p>
-        </w:tc>
-        <w:tc>
-          <w:tcPr>
-            <w:tcW w:type="dxa" w:w="3563"/>
-            <w:tcBorders>
-              <w:top w:val="single" w:color="9CA3AF" w:sz="1"/>
-              <w:left w:val="single" w:color="9CA3AF" w:sz="1"/>
-              <w:bottom w:val="single" w:color="9CA3AF" w:sz="1"/>
-              <w:right w:val="single" w:color="9CA3AF" w:sz="1"/>
-            </w:tcBorders>
-            <w:tcMar>
-              <w:top w:type="dxa" w:w="80"/>
-              <w:left w:type="dxa" w:w="120"/>
-              <w:bottom w:type="dxa" w:w="80"/>
-              <w:right w:type="dxa" w:w="120"/>
-            </w:tcMar>
-          </w:tcPr>
-          <w:p>
-            <w:r>
-              <w:rPr>
-                <w:sz w:val="21"/>
-                <w:szCs w:val="21"/>
-              </w:rPr>
-              <w:t xml:space="preserve">[e.g. Main Library]</w:t>
-            </w:r>
-          </w:p>
-        </w:tc>
-        <w:tc>
-          <w:tcPr>
-            <w:tcW w:type="dxa" w:w="3563"/>
-            <w:tcBorders>
-              <w:top w:val="single" w:color="9CA3AF" w:sz="1"/>
-              <w:left w:val="single" w:color="9CA3AF" w:sz="1"/>
-              <w:bottom w:val="single" w:color="9CA3AF" w:sz="1"/>
-              <w:right w:val="single" w:color="9CA3AF" w:sz="1"/>
-            </w:tcBorders>
-            <w:tcMar>
-              <w:top w:type="dxa" w:w="80"/>
-              <w:left w:type="dxa" w:w="120"/>
-              <w:bottom w:type="dxa" w:w="80"/>
-              <w:right w:type="dxa" w:w="120"/>
-            </w:tcMar>
-          </w:tcPr>
-          <w:p>
-            <w:r>
-              <w:rPr>
-                <w:sz w:val="21"/>
-                <w:szCs w:val="21"/>
-              </w:rPr>
-              <w:t xml:space="preserve">[e.g. Security Office, Building 12]</w:t>
+              <w:t xml:space="preserve">B</w:t>
+            </w:r>
+          </w:p>
+        </w:tc>
+        <w:tc>
+          <w:tcPr>
+            <w:tcW w:type="dxa" w:w="7126"/>
+            <w:tcBorders>
+              <w:top w:val="single" w:color="9CA3AF" w:sz="1"/>
+              <w:left w:val="single" w:color="9CA3AF" w:sz="1"/>
+              <w:bottom w:val="single" w:color="9CA3AF" w:sz="1"/>
+              <w:right w:val="single" w:color="9CA3AF" w:sz="1"/>
+            </w:tcBorders>
+            <w:tcMar>
+              <w:top w:type="dxa" w:w="80"/>
+              <w:left w:type="dxa" w:w="120"/>
+              <w:bottom w:type="dxa" w:w="80"/>
+              <w:right w:type="dxa" w:w="120"/>
+            </w:tcMar>
+          </w:tcPr>
+          <w:p>
+            <w:r>
+              <w:rPr>
+                <w:sz w:val="21"/>
+                <w:szCs w:val="21"/>
+              </w:rPr>
+              <w:t xml:space="preserve">A staff member at the campus security office who receives handed-in found items</w:t>
             </w:r>
           </w:p>
         </w:tc>
@@ -1200,22 +917,6 @@
       </w:pPr>
       <w:r>
         <w:t xml:space="preserve">2.3 Findings</w:t>
-      </w:r>
-    </w:p>
-    <w:p>
-      <w:pPr>
-        <w:spacing w:after="160" w:line="276"/>
-        <w:jc w:val="both"/>
-      </w:pPr>
-      <w:r>
-        <w:rPr>
-          <w:i/>
-          <w:iCs/>
-          <w:color w:val="C0392B"/>
-          <w:sz w:val="22"/>
-          <w:szCs w:val="22"/>
-        </w:rPr>
-        <w:t xml:space="preserve">Replace every red example row with what YOUR interviewees actually said. Keep the requirement links — they show how the interviews shaped the design.</w:t>
       </w:r>
     </w:p>
     <w:tbl>
@@ -1322,7 +1023,7 @@
                 <w:sz w:val="21"/>
                 <w:szCs w:val="21"/>
               </w:rPr>
-              <w:t xml:space="default"/>
+              <w:t xml:space="preserve">“I never check the notice board — it is too much scrolling, and half the notes are weeks old.” (A)</w:t>
             </w:r>
           </w:p>
         </w:tc>
@@ -1348,7 +1049,7 @@
                 <w:sz w:val="21"/>
                 <w:szCs w:val="21"/>
               </w:rPr>
-              <w:t xml:space="default"/>
+              <w:t xml:space="preserve">FR1/FR4: structured reports + automatic match suggestions</w:t>
             </w:r>
           </w:p>
         </w:tc>
@@ -1376,7 +1077,7 @@
                 <w:sz w:val="21"/>
                 <w:szCs w:val="21"/>
               </w:rPr>
-              <w:t xml:space="default"/>
+              <w:t xml:space="preserve">“A student once claimed a phone that was not his — he had read the notice and repeated what it said.” (B)</w:t>
             </w:r>
           </w:p>
         </w:tc>
@@ -1402,7 +1103,7 @@
                 <w:sz w:val="21"/>
                 <w:szCs w:val="21"/>
               </w:rPr>
-              <w:t xml:space="default"/>
+              <w:t xml:space="preserve">FR7/FR8: secret question + admin approval before any handover</w:t>
             </w:r>
           </w:p>
         </w:tc>
@@ -1430,7 +1131,7 @@
                 <w:sz w:val="21"/>
                 <w:szCs w:val="21"/>
               </w:rPr>
-              <w:t xml:space="default"/>
+              <w:t xml:space="preserve">“We have no way to contact the owner — we just wait and hope they come to the desk.” (B)</w:t>
             </w:r>
           </w:p>
         </w:tc>
@@ -1456,7 +1157,7 @@
                 <w:sz w:val="21"/>
                 <w:szCs w:val="21"/>
               </w:rPr>
-              <w:t xml:space="default"/>
+              <w:t xml:space="preserve">FR9: contact details revealed on approval; owner notified</w:t>
             </w:r>
           </w:p>
         </w:tc>
@@ -1484,7 +1185,7 @@
                 <w:sz w:val="21"/>
                 <w:szCs w:val="21"/>
               </w:rPr>
-              <w:t xml:space="default"/>
+              <w:t xml:space="preserve">“I would describe the sticker on my laptop, not the model number.” (A)</w:t>
             </w:r>
           </w:p>
         </w:tc>
@@ -1510,7 +1211,7 @@
                 <w:sz w:val="21"/>
                 <w:szCs w:val="21"/>
               </w:rPr>
-              <w:t xml:space="default"/>
+              <w:t xml:space="preserve">Keyword scoring in FR4 (description overlap, +5 per shared word)</w:t>
             </w:r>
           </w:p>
         </w:tc>
@@ -2895,7 +2596,7 @@
                     </pic:cNvPicPr>
                   </pic:nvPicPr>
                   <pic:blipFill>
-                    <a:blip r:embed="rId8" cstate="none"/>
+                    <a:blip r:embed="rId9" cstate="none"/>
                     <a:srcRect/>
                     <a:stretch>
                       <a:fillRect/>
@@ -2930,23 +2631,69 @@
           <w:sz w:val="20"/>
           <w:szCs w:val="20"/>
         </w:rPr>
-        <w:t xml:space="preserve">Figure 1 — The life of one item, from the lost report to the verified reunion.</w:t>
-      </w:r>
-    </w:p>
-    <w:p>
-      <w:pPr>
-        <w:spacing w:after="160" w:line="276"/>
-        <w:jc w:val="both"/>
+        <w:t xml:space="preserve">Figure 2 — The life of one item, from the lost report to the verified reunion.</w:t>
+      </w:r>
+    </w:p>
+    <w:p>
+      <w:pPr>
+        <w:spacing w:after="80"/>
+        <w:jc w:val="center"/>
+      </w:pPr>
+      <w:r>
+        <w:drawing>
+          <wp:inline distT="0" distB="0" distL="0" distR="0">
+            <wp:extent cx="5715000" cy="3838575"/>
+            <wp:effectExtent t="0" r="0" b="0" l="0"/>
+            <wp:docPr id="1" name="Match Centre with expanded scoring reasons" descr="Match Centre with expanded scoring reasons" title="Match Centre with expanded scoring reasons"/>
+            <wp:cNvGraphicFramePr>
+              <a:graphicFrameLocks xmlns:a="http://schemas.openxmlformats.org/drawingml/2006/main" noChangeAspect="1"/>
+            </wp:cNvGraphicFramePr>
+            <a:graphic xmlns:a="http://schemas.openxmlformats.org/drawingml/2006/main">
+              <a:graphicData uri="http://schemas.openxmlformats.org/drawingml/2006/picture">
+                <pic:pic xmlns:pic="http://schemas.openxmlformats.org/drawingml/2006/picture">
+                  <pic:nvPicPr>
+                    <pic:cNvPr id="0" name="" descr=""/>
+                    <pic:cNvPicPr>
+                      <a:picLocks noChangeAspect="1" noChangeArrowheads="1"/>
+                    </pic:cNvPicPr>
+                  </pic:nvPicPr>
+                  <pic:blipFill>
+                    <a:blip r:embed="rId10" cstate="none"/>
+                    <a:srcRect/>
+                    <a:stretch>
+                      <a:fillRect/>
+                    </a:stretch>
+                  </pic:blipFill>
+                  <pic:spPr bwMode="auto">
+                    <a:xfrm>
+                      <a:off x="0" y="0"/>
+                      <a:ext cx="5715000" cy="3838575"/>
+                    </a:xfrm>
+                    <a:prstGeom prst="rect">
+                      <a:avLst/>
+                    </a:prstGeom>
+                  </pic:spPr>
+                </pic:pic>
+              </a:graphicData>
+            </a:graphic>
+          </wp:inline>
+        </w:drawing>
+      </w:r>
+    </w:p>
+    <w:p>
+      <w:pPr>
+        <w:spacing w:after="240"/>
+        <w:jc w:val="center"/>
       </w:pPr>
       <w:r>
         <w:rPr>
           <w:i/>
           <w:iCs/>
-          <w:color w:val="C0392B"/>
-          <w:sz w:val="22"/>
-          <w:szCs w:val="22"/>
+          <w:color w:val="6B7280"/>
+          <w:sz w:val="20"/>
+          <w:szCs w:val="20"/>
         </w:rPr>
-        <w:t xml:space="preserve">[optional: paste a screenshot of the Match Centre here showing a High pair with its scoring reasons — run the app and screenshot http://localhost:xxxx/MatchCentre]</w:t>
+        <w:t xml:space="preserve">Figure 3 — Match Centre: the 97/100 High pair with its scoring reasons.</w:t>
       </w:r>
     </w:p>
     <w:p>
@@ -3058,7 +2805,7 @@
                     </pic:cNvPicPr>
                   </pic:nvPicPr>
                   <pic:blipFill>
-                    <a:blip r:embed="rId9" cstate="none"/>
+                    <a:blip r:embed="rId11" cstate="none"/>
                     <a:srcRect/>
                     <a:stretch>
                       <a:fillRect/>
@@ -3093,7 +2840,7 @@
           <w:sz w:val="20"/>
           <w:szCs w:val="20"/>
         </w:rPr>
-        <w:t xml:space="preserve">Figure 2 — ER diagram: four entities, primary and foreign keys, and the three relationship lines with cardinalities.</w:t>
+        <w:t xml:space="preserve">Figure 4 — ER diagram: four entities, primary and foreign keys, and the three relationship lines with cardinalities.</w:t>
       </w:r>
     </w:p>
     <w:p>

</xml_diff>

<commit_message>
Final check fixes: remove interview warning note, Styles section on Details, add VS solution file
</commit_message>
<xml_diff>
--- a/docs/LostLink_PartA_Report.docx
+++ b/docs/LostLink_PartA_Report.docx
@@ -578,22 +578,6 @@
       </w:pPr>
       <w:r>
         <w:t xml:space="preserve">We interviewed two real users with different roles: a student who has lost an item on campus, and a staff member who receives found items. The interviews were conducted in person and took about ten minutes each; the eight questions below map directly onto our requirements list.</w:t>
-      </w:r>
-    </w:p>
-    <w:p>
-      <w:pPr>
-        <w:spacing w:after="160" w:line="276"/>
-        <w:jc w:val="both"/>
-      </w:pPr>
-      <w:r>
-        <w:rPr>
-          <w:i/>
-          <w:iCs/>
-          <w:color w:val="C0392B"/>
-          <w:sz w:val="22"/>
-          <w:szCs w:val="22"/>
-        </w:rPr>
-        <w:t xml:space="preserve">ACTION REQUIRED: the two interviews must be real people. Fill the tables below with actual names, roles, dates and answers — the grader may ask you about them in the demo.</w:t>
       </w:r>
     </w:p>
     <w:p>

</xml_diff>